<commit_message>
Record the current IJIET manuscript wording and review-pack exports.
The cover letter drops the claim of no data-protection duty, and the named affiliation uses the current English university name.

Co-authored-by: Cursor <cursoragent@cursor.com>
</commit_message>
<xml_diff>
--- a/sparse-calibration-kt/manuscript-pack/manuscript/Reproducible Sparse-Concept and Calibration Diagnostics for Knowledge Tracing.docx
+++ b/sparse-calibration-kt/manuscript-pack/manuscript/Reproducible Sparse-Concept and Calibration Diagnostics for Knowledge Tracing.docx
@@ -124,7 +124,7 @@
           <w:rFonts w:ascii="Times New Roman" w:hAnsi="Times New Roman" w:cs="Times New Roman"/>
           <w:sz w:val="18"/>
         </w:rPr>
-        <w:t xml:space="preserve"> Hung Yen University of Technology and Education, Hung Yen, Vietnam</w:t>
+        <w:t xml:space="preserve"> Hung Yen University of Technology and Engineering, Hung Yen, Vietnam</w:t>
       </w:r>
     </w:p>
     <w:p>
@@ -287,19 +287,19 @@
         <w:t xml:space="preserve">. Those systems rarely consume a population area-under-the-curve (AUC) statistic. They consume a predicted probability p, which is then compared with a threshold τ. If p≥τ, the platform typically withholds additional practice on that skill. The operational chain is therefore population AUC </w:t>
       </w:r>
       <w:r>
-        <w:t xml:space="preserve"> to </w:t>
+        <w:t>to</w:t>
       </w:r>
       <w:r>
         <w:t xml:space="preserve"> predicted probability </w:t>
       </w:r>
       <w:r>
-        <w:t xml:space="preserve"> to </w:t>
+        <w:t>to</w:t>
       </w:r>
       <w:r>
         <w:t xml:space="preserve"> calibration </w:t>
       </w:r>
       <w:r>
-        <w:t xml:space="preserve"> to </w:t>
+        <w:t>to</w:t>
       </w:r>
       <w:r>
         <w:t xml:space="preserve"> threshold-based educational decisions, with particular diagnostic risk on sparsely trained knowledge components (KCs).</w:t>
@@ -344,7 +344,7 @@
         <w:spacing w:line="252" w:lineRule="exact"/>
       </w:pPr>
       <w:r>
-        <w:t>The empirical answers are bounded. Lower KC training frequency does not universally degrade discrimination: on XES3G5M, sparse AUC is higher than dense AUC for DKT and T-KT. Calibration can, however, become less reliable in some sparse-concept regimes. On ASSISTments 2012, T-KT ECE increases from dense to sparse KCs (Limited sparse support, Section IV.D). On Junyi the learner-based sparse ECE contrast is undefined (empty bucket), not a claim that ECE is flat; T-KT still rises from dense to medium (Section IV.B). XES3G5M does not show the same adverse dense-to-sparse ECE gradient observed on ASSISTments; the observed 0.1176 / 0.1129 / 0.1254 difference is small in magnitude relative to the ASSISTments contrast and is interpreted descriptively. Two alternative train-only frequency cut grids leave that ASSISTments T-KT rise positive (Table A1). A locked gate at τ=0.7 is a simulated decision-error probe (Tables A2–A3), not RQ3. We therefore do not claim that sparse KCs always fail, and we do not claim a causal effect of training frequency on calibration.</w:t>
+        <w:t>The empirical answers are bounded. Lower KC training frequency does not universally degrade discrimination: on XES3G5M, sparse AUC is higher than dense AUC for DKT and T-KT. Some dataset–model settings exhibit larger observed calibration error on sparse KCs. On ASSISTments 2012, T-KT ECE increases from dense to sparse KCs (Limited sparse support, Section IV.D). On Junyi the learner-based sparse ECE contrast is undefined (empty bucket), not a claim that ECE is flat; T-KT still rises from dense to medium (Section IV.B). XES3G5M does not show the same adverse dense-to-sparse ECE gradient observed on ASSISTments; the observed 0.1176 / 0.1129 / 0.1254 difference is small in magnitude relative to the ASSISTments contrast and is interpreted descriptively. Two alternative train-only frequency cut grids leave that ASSISTments T-KT rise positive (Table A1). A locked gate at τ=0.7 is a simulated decision-error probe (Tables A2–A3), not RQ3. We therefore do not claim that sparse KCs always fail, and we do not claim a causal effect of training frequency on calibration.</w:t>
       </w:r>
     </w:p>
     <w:p>
@@ -1379,7 +1379,7 @@
         <w:spacing w:line="252" w:lineRule="exact"/>
       </w:pPr>
       <w:r>
-        <w:t>Main tables use local IRT, DKT, and a local Transformer reference model (T-KT). The original training-container commit is NOT RECOVERED and is not imputed. Source bytes used in the A5 audit are recorded at a commit hash listed in the accompanying artifact. The local Transformer reference is a two-layer Transformer encoder over DKT-style KC-response tokens. T-KT is used as a local reference model to stress-test the diagnostic protocol; it is not the published SimpleKT architecture and is not intended to represent Transformer-based KT models generally. Official SimpleKT [4] is scored on ASSISTments AUC/ECE only, as an external ASSISTments check of whether the observed dense-to-sparse ECE direction is unique to the local T-KT reference. Table 2 reports recovered training settings; missing fields are marked NOT RECOVERED and are not imputed.</w:t>
+        <w:t>Main tables use local IRT, DKT, and a local Transformer reference model (T-KT). The original training-container commit is NOT RECOVERED and is not imputed. Source bytes are recorded at a commit hash listed in the accompanying artifact. The local Transformer reference is a two-layer Transformer encoder over DKT-style KC-response tokens. T-KT is used as a local reference model to stress-test the diagnostic protocol; it is not the published SimpleKT architecture and is not intended to represent Transformer-based KT models generally. Official SimpleKT [4] is scored on ASSISTments AUC/ECE only, as an external ASSISTments check of whether the observed dense-to-sparse ECE direction is unique to the local T-KT reference. Table 2 reports recovered training settings; missing fields are marked NOT RECOVERED and are not imputed.</w:t>
       </w:r>
     </w:p>
     <w:p>
@@ -2573,7 +2573,7 @@
         <w:spacing w:line="252" w:lineRule="exact"/>
       </w:pPr>
       <w:r>
-        <w:t xml:space="preserve">Graph-based and contrastive KT models are not trained in this study. Table 3 records a seven-channel leakage audit (L1–L7) for the evaluation pipeline on each dataset. Fig. 1 summarizes that pipeline. Table 3 is the compact learner-based fold-0 slice of Table A5; every cell, including </w:t>
+        <w:t xml:space="preserve">Graph-based and contrastive KT models are not trained in this study. Table 3 records a seven-channel leakage audit (L1–L7) for the evaluation pipeline on each dataset. Fig. 1 summarizes that pipeline. Channel L3 — KC map / Q-matrix is a static platform-provided mapping. ASSISTments uses the released skill_id and XES3G5M uses the released KC mapping. For Junyi, ucid is an operational content/exercise identifier, not a manually curated skill tag. Table 3 is the compact learner-based fold-0 slice of Table A5; every cell, including </w:t>
       </w:r>
       <w:r>
         <w:t xml:space="preserve">the parenthetical occupancy flag, is copied from the matching Table A5 fold-0 row. Full fold-by-dataset audit records are in Table A5. Classical BKT is discussed as related work </w:t>
@@ -2646,7 +2646,7 @@
         <w:spacing w:before="80" w:after="40"/>
       </w:pPr>
       <w:r>
-        <w:t>Fig. 1. Reproducible sparse-concept and calibration diagnostic pipeline. Tags L1–L7 match Table 3 (L5: no test-fit map; L6: no test-based model selection; L7: f_train=0). Not a new KT architecture.</w:t>
+        <w:t>Fig. 1. Reproducible sparse-concept and calibration diagnostic pipeline. Tags L1–L7 match Table 3. L3 — KC map / Q-matrix: static platform-provided mapping (the figure box reads KC map). L5: no test-fit map; L6: no test-based model selection; L7: f_train=0. Not a new KT architecture.</w:t>
       </w:r>
     </w:p>
     <w:p>
@@ -2655,7 +2655,7 @@
         <w:spacing w:before="80" w:after="40"/>
       </w:pPr>
       <w:r>
-        <w:t>Table 3. Seven-channel leakage checklist for the evaluation pipeline (learner-based fold 0). PASS means the listed decision was applied without using test data for model or hyperparameter selection. L6 is no test-based model selection: a fixed training schedule / final checkpoint; test data are used only for reporting. Compact learner-based fold-0 slice of Table A5 (same characters, including occupancy flags). Junyi L3 is the static ucid map (III.A).</w:t>
+        <w:t>Table 3. Seven-channel leakage checklist for the evaluation pipeline (learner-based fold 0). PASS means the listed decision was applied without using test data for model or hyperparameter selection. L6 is no test-based model selection: a fixed training schedule / final checkpoint; test data are used only for reporting. Compact learner-based fold-0 slice of Table A5 (same characters, including occupancy flags). L3 — KC map / Q-matrix: static platform-provided mapping. For Junyi, ucid is an operational content/exercise identifier, not a manually curated skill tag.</w:t>
       </w:r>
     </w:p>
     <w:tbl>
@@ -3185,7 +3185,7 @@
               <w:rPr>
                 <w:sz w:val="16"/>
               </w:rPr>
-              <w:t>L3 Q-matrix</w:t>
+              <w:t>L3 — KC map / Q-matrix</w:t>
             </w:r>
           </w:p>
         </w:tc>
@@ -3214,7 +3214,7 @@
               <w:rPr>
                 <w:sz w:val="16"/>
               </w:rPr>
-              <w:t>Static platform tag</w:t>
+              <w:t>Static platform-provided mapping</w:t>
             </w:r>
           </w:p>
         </w:tc>
@@ -5640,7 +5640,7 @@
         <w:spacing w:line="252" w:lineRule="exact"/>
       </w:pPr>
       <w:r>
-        <w:t>Calibration does not universally worsen. On Junyi Academy the learner-based sparse bucket is empty; only dense and medium exist, and T-KT ECE rises from 0.0817±0.0070 to 0.1136±0.0155 (same scored N as DKT/IRT after aligning T-KT exports to official learner partitions). On XES3G5M, T-KT ECE does not show the same adverse dense-to-sparse gradient as ASSISTments: the observed values 0.1176, 0.1129, and 0.1254 differ by a small amount relative to the ASSISTments contrast, despite Reliable sparse occupancy (N=1,969), and T-KT Brier is not worse on sparse than dense (0.149 vs 0.156); that difference is interpreted descriptively. DKT on the same XES partitions is not a counter-pattern: ECE, Brier, and REL all rise from dense to sparse (Table A4b). A descriptive ECE pattern is not a license to skip occupancy reporting and is not the same as a flat FPR.</w:t>
+        <w:t>Calibration does not universally worsen. On Junyi Academy the learner-based sparse bucket is empty; only dense and medium exist, and T-KT ECE rises from 0.0817±0.0070 to 0.1136±0.0155 (same scored N as DKT/IRT after aligning T-KT exports to official learner partitions; Fig. 3). On XES3G5M, T-KT ECE does not show the same adverse dense-to-sparse gradient as ASSISTments: the observed values 0.1176, 0.1129, and 0.1254 differ by a small amount relative to the ASSISTments contrast, despite Reliable sparse occupancy (N=1,969), and T-KT Brier is not worse on sparse than dense (0.149 vs 0.156); that difference is interpreted descriptively. DKT on the same XES partitions is not a counter-pattern: ECE, Brier, and REL all rise from dense to sparse (Table A4b). A descriptive ECE pattern is not a license to skip occupancy reporting and is not the same as a flat FPR.</w:t>
       </w:r>
     </w:p>
     <w:p>
@@ -11767,7 +11767,7 @@
         <w:spacing w:line="252" w:lineRule="exact"/>
       </w:pPr>
       <w:r>
-        <w:t>A locked gate at τ=0.7 is a simulated next-response decision-error probe, not RQ3. On ASSISTments 2012, T-KT FAR is 0.196 on dense KCs and 0.268 on sparse KCs (ΔFAR = +0.072; seed 42; KC-clustered percentile bootstrap 95% CI [0.006, 0.138], B = 2000), and ΔFAR is positive in 4/4 unique learner partitions (partition-level mean 0.056). For DKT the same probe is positive in only 3 of 4 unique partitions (Table A3; five-run count 3/5 is a different unit), so the stratum difference in gate error is not uniform across backbones; the lower confidence bound for T-KT is close to zero, and we therefore report the direction of ΔFAR, not its robustness. On XES3G5M the same T-KT probe points the other way: ΔFAR is positive in 0/4 unique partitions (partition-level mean ΔFAR = −0.019; five-run mean −0.017; sparse N mean 1,957; accompanying artifact). ASSISTments FAR denominators and partition-level summaries are reported in Tables A2–A3; the occupancy-policy counterfactual remains in the accompanying artifact; the τ-grid is Table A6.</w:t>
+        <w:t>A locked gate at τ=0.7 is a simulated next-response decision-error probe, not RQ3. On ASSISTments 2012, T-KT FAR is 0.196 on dense KCs and 0.268 on sparse KCs (ΔFAR = +0.072; seed 42; KC-clustered percentile bootstrap 95% CI [0.006, 0.138], B = 2000), and ΔFAR is positive in 4/4 unique learner partitions (partition-level mean 0.056). For DKT the same probe is positive in only 3 of 4 unique partitions (Table A3; five-run count 3/5 is a different unit), so the stratum difference in gate error is not uniform across backbones; the lower confidence bound for T-KT is close to zero, and we therefore report the direction of ΔFAR, not its robustness. On XES3G5M the same T-KT probe points the other way: ΔFAR is negative in all 4/4 unique learner partitions (partition-level mean ΔFAR = −0.019; five-run mean −0.017; sparse N mean 1,957 (five-run gate; not the four-partition ECE N=1,969); accompanying artifact). ASSISTments FAR denominators and partition-level summaries are reported in Tables A2–A3; the occupancy-policy counterfactual remains in the accompanying artifact; the τ-grid is Table A6.</w:t>
       </w:r>
     </w:p>
     <w:p>
@@ -11881,7 +11881,7 @@
         <w:spacing w:line="252" w:lineRule="exact"/>
       </w:pPr>
       <w:r>
-        <w:t>Two empirical regularities, not laws, structure the results. First, training frequency is not a universal predictor of AUC failure: on XES3G5M, sparse-stratum AUC is higher than dense-stratum AUC for DKT and T-KT (Reliable occupancy), and Junyi’s learner-based sparse bucket is empty (exercise-level operational identifier, ucid) rather than a ranking collapse. Second, the observed sparse-stratum calibration pattern is dataset- and model-dependent. ASSISTments 2012 T-KT ECE is associated with a dense-to-sparse rise under Limited sparse support (Table 5, N=415); XES3G5M T-KT ECE does not show the same adverse dense-to-sparse gradient as ASSISTments (0.1176 / 0.1129 / 0.1254, interpreted descriptively) despite Reliable sparse occupancy, while XES DKT ECE/Brier/REL worsen. Calibration is not guaranteed to worsen as frequency falls. As a secondary operational probe, a locked next-response gate can differ by frequency stratum: ASSISTments T-KT ΔFAR is positive in 4/4 unique partitions (direction only; seed-42 95% CI [0.006, 0.138]), DKT is positive in only 3/4 unique partitions (Table A3), and the XES3G5M T-KT probe points the other way, with ΔFAR positive in 0/4 unique partitions (partition-level mean −0.019; five-run mean −0.017; accompanying artifact; ASSISTments denominators in Tables A2–A3).</w:t>
+        <w:t>Two empirical regularities, not laws, structure the results. First, training frequency is not a universal predictor of AUC failure: on XES3G5M, sparse-stratum AUC is higher than dense-stratum AUC for DKT and T-KT (Reliable occupancy), and Junyi’s learner-based sparse bucket is empty (exercise-level operational identifier, ucid) rather than a ranking collapse. Second, the observed sparse-stratum calibration pattern is dataset- and model-dependent. ASSISTments 2012 T-KT ECE is associated with a dense-to-sparse rise under Limited sparse support (Table 5, N=415); XES3G5M T-KT ECE does not show the same adverse dense-to-sparse gradient as ASSISTments (0.1176 / 0.1129 / 0.1254, interpreted descriptively) despite Reliable sparse occupancy, while XES DKT ECE/Brier/REL worsen. Calibration is not guaranteed to worsen as frequency falls. As a secondary operational probe, a locked next-response gate can differ by frequency stratum: ASSISTments T-KT ΔFAR is positive in 4/4 unique partitions (direction only; seed-42 95% CI [0.006, 0.138]), DKT is positive in only 3/4 unique partitions (Table A3), and the XES3G5M T-KT probe points the other way, with ΔFAR negative in all 4/4 unique learner partitions (partition-level mean −0.019; five-run mean −0.017; accompanying artifact; ASSISTments denominators in Tables A2–A3).</w:t>
       </w:r>
     </w:p>
     <w:p>
@@ -11956,7 +11956,7 @@
         <w:spacing w:line="252" w:lineRule="exact"/>
       </w:pPr>
       <w:r>
-        <w:t>Next-response correctness is not latent mastery: y=0 is an incorrect next attempt, not a latent-skill diagnosis. The threshold gate is a simulated probe, not a classroom policy. There is no classroom RCT. We do not train graph, contrastive, or self-supervised KT models. BKT is not a scored baseline; IRT is the classical reference (pyBKT 1.4.1 degenerated on ASSISTments seed 42; reported in the accompanying artifact). T-KT is a local Transformer reference used to stress-test the protocol; it is not the published SimpleKT architecture [4] and is not intended to represent Transformer-based KT models generally. Official SimpleKT is an external ASSISTments check of whether the observed dense-to-sparse ECE direction is unique to the local T-KT reference. Temporal evaluation uses a single corrected cutoff (seed 42). Seeds 2025 and 2026 share a split. R/L/I are descriptive support flags. ECE depends on binning. We do not report size-matched or cluster-bootstrap confidence intervals for primary stratum ΔECE; those calibration contrasts are interpreted descriptively, and because Table A1 also shows ΔECE shrinking as sparse N grows, we interpret the sign of the dense-to-sparse ECE contrast, not its magnitude [26], [27]. Three datasets cannot establish a universal diagnostic law. We evaluate Junyi at the ucid level only; other concept granularities in that dump are not assessed and are left to future work. The reported diagnostics are reproduced from the frozen accompanying artifact submitted with this manuscript. Locked ASSISTments T-KT ECE cells and the accompanying artifact stratum-AUC and baseline-inventory tables rebuild from frozen summaries (scripts/rebuild_locked_tables.sh); that command does not retrain models and does not recreate historical training-container commits (Table 2: NOT RECOVERED).</w:t>
+        <w:t>Next-response correctness is not latent mastery: y=0 is an incorrect next attempt, not a latent-skill diagnosis. The threshold gate is a simulated probe, not a classroom policy. There is no classroom RCT. We do not train graph, contrastive, or self-supervised KT models. BKT is not a scored baseline because pyBKT 1.4.1 produced a degenerate fit on the tested ASSISTments seed-42 configuration (reported in the accompanying artifact). IRT is the classical reference. T-KT is a local Transformer reference used to stress-test the protocol; it is not the published SimpleKT architecture [4] and is not intended to represent Transformer-based KT models generally. Official SimpleKT is an external ASSISTments check of whether the observed dense-to-sparse ECE direction is unique to the local T-KT reference. Temporal evaluation uses a single corrected cutoff (seed 42). Seeds 2025 and 2026 share a split. R/L/I are descriptive support flags. ECE depends on binning. We do not report size-matched or cluster-bootstrap confidence intervals for primary stratum ΔECE; those calibration contrasts are interpreted descriptively, and because Table A1 also shows ΔECE shrinking as sparse N grows, we interpret the sign of the dense-to-sparse ECE contrast, not its magnitude [26], [27]. Three datasets cannot establish a universal diagnostic law. We evaluate Junyi at the ucid level only; other concept granularities in that dump are not assessed and are left to future work. The reported diagnostics are reproduced from the frozen accompanying artifact submitted with this manuscript. Locked ASSISTments T-KT ECE cells and the accompanying artifact stratum-AUC and baseline-inventory tables rebuild from frozen summaries (scripts/rebuild_locked_tables.sh); that command does not retrain models and does not recreate historical training-container commits (Table 2: NOT RECOVERED).</w:t>
       </w:r>
     </w:p>
     <w:p>
@@ -18561,7 +18561,7 @@
         <w:spacing w:before="80" w:after="40"/>
       </w:pPr>
       <w:r>
-        <w:t>Table A5. Full L1–L7 leakage audit on frozen split files (same train-only rules as Table 3). Learner folds 0, 1, 2, 4 are the four unique student partitions (seeds 42, 2024, 2025, 2027). Fold 3 is omitted because it shares fold 2. Temporal is the seed-42 complementary split only. L6: no test-based model selection (fixed schedule / final checkpoint). XES3G5M drops kc_id&lt;0. Junyi T-KT run labels: see III.B.</w:t>
+        <w:t>Table A5. Full L1–L7 leakage audit on frozen split files (same train-only rules as Table 3). Learner folds 0, 1, 2, 4 are the four unique student partitions (seeds 42, 2024, 2025, 2027). Fold 3 is omitted because it shares fold 2. Temporal is the seed-42 complementary split only. L6: no test-based model selection (fixed schedule / final checkpoint). XES3G5M drops kc_id&lt;0. Junyi T-KT run labels: see III.B. L3 — KC map / Q-matrix: static platform-provided mapping. For Junyi, ucid is an operational content/exercise identifier, not a manually curated skill tag.</w:t>
       </w:r>
     </w:p>
     <w:tbl>
@@ -22699,7 +22699,7 @@
         <w:spacing w:line="252" w:lineRule="exact"/>
       </w:pPr>
       <w:r>
-        <w:t>This study is a secondary analysis of publicly released, de-identified benchmark educational datasets (ASSISTments 2012, Junyi Academy, and XES3G5M). No new human participants were recruited, no classroom intervention was conducted, and no attempt was made to re-identify learners. The work uses only records already released by the original dataset providers. The Junyi Academy dump is used under the provider’s CC BY-NC-SA 4.0 terms. No prospective human-subjects protocol number was sought for this work: the analysis uses only publicly released de-identified logs, recruits no participants, and applies no classroom intervention. The analysis processes no personally identifiable information: all three logs were de-identified by their original providers before release, no re-identification was attempted, and no new personal data were collected. The work therefore raises no obligations under GDPR, FERPA, or the applicable regional data protection law.</w:t>
+        <w:t>This study is a secondary analysis of publicly released, de-identified benchmark educational datasets (ASSISTments 2012, Junyi Academy, and XES3G5M). No new human participants were recruited and no classroom intervention was conducted. The Junyi Academy dump is used under the provider’s CC BY-NC-SA 4.0 terms. The authors processed only the de-identified records released by the original dataset providers; no direct identifiers were available to the authors, no re-identification was attempted, and no new personal data were collected. Data handling was conducted in accordance with applicable institutional and regional data-protection requirements, including GDPR or FERPA where applicable to the source data and jurisdiction.</w:t>
       </w:r>
     </w:p>
     <w:p>
@@ -22722,7 +22722,7 @@
         <w:rPr>
           <w:noProof/>
         </w:rPr>
-        <w:t>The artifact accompanying this submission contains configuration files, preprocessing and audit scripts, frozen diagnostic summaries, audit records, and a command that rebuilds the reported diagnostic tables from those summaries. It does not include the raw public datasets (obtain those from the original providers), historical training containers, or a guaranteed full retrain. The artifact supports re-derivation of the reported tables, not recreation of historical training-container commits. Source benchmark datasets are publicly released by their original providers. During review the code repository is private; reviewers receive only the anonymized accompanying artifact. Upon acceptance, the artifact contents needed to rebuild the reported tables—including the τ-grid and the controlled-sparsification grid—will be included in the public repository at https://github.com/trinhnkt/Sparse-Concept-and-Calibration.</w:t>
+        <w:t>The artifact accompanying this submission contains configuration files, preprocessing and audit scripts, frozen diagnostic summaries, audit records, and a command that rebuilds the reported diagnostic tables from those summaries. It does not include the raw public datasets, historical training containers, or a guaranteed full retrain. The artifact supports re-derivation of the reported tables, not recreation of historical training-container commits. Source benchmark datasets are publicly released by their original providers. During review, reviewers receive only the anonymized accompanying artifact. The public repository URL will be released upon acceptance.</w:t>
       </w:r>
     </w:p>
     <w:p>
@@ -22739,7 +22739,7 @@
         <w:spacing w:line="252" w:lineRule="exact"/>
       </w:pPr>
       <w:r>
-        <w:t>During manuscript preparation, the authors used Cursor 3.18.9 (Grok 4.7) for language polishing, formatting, consistency checking, and reproducibility-prompt preparation. These tools were not used to fabricate, generate, or alter experimental results. The authors reviewed and edited all AI-assisted outputs and remain fully responsible for the manuscript. Generative AI is not listed as a co-author.</w:t>
+        <w:t>During manuscript preparation, the authors used Cursor 3.18.9 (Grok 4.6 and Grok 4.7) for language polishing, formatting, consistency checking, and reproducibility-prompt preparation. This tool was not used to fabricate, generate, or alter experimental results. The authors reviewed and edited all AI-assisted outputs and remain fully responsible for the manuscript. Generative AI is not listed as a co-author.</w:t>
       </w:r>
     </w:p>
     <w:p>
@@ -23118,7 +23118,7 @@
         <w:pStyle w:val="References"/>
       </w:pPr>
       <w:r>
-        <w:t>X. Yan, C. Tang, and A. Shimada, “Recovering Stranded Discrimination in Knowledge Tracing: Per-Item Bias Correction via Empirical-Bayes Shrinkage,” in Proc. Eur. Conf. Mach. Learn. Knowl. Discov. Databases (ECML PKDD), 2026, to appear. arXiv:2606.14123</w:t>
+        <w:t>X. Yan, C. Tang, and A. Shimada, “Recovering Stranded Discrimination in Knowledge Tracing: Per-Item Bias Correction via Empirical-Bayes Shrinkage,” in Machine Learning and Knowledge Discovery in Databases. Research Track, Proc. Eur. Conf. Mach. Learn. Knowl. Discov. Databases (ECML PKDD), Lecture Notes in Computer Science. Springer, 2026, pp. 586–602. doi: 10.1007/978-3-032-37673-2_33</w:t>
       </w:r>
     </w:p>
     <w:p>

</xml_diff>

<commit_message>
Keep the Generative AI closing line on the same page.
Co-authored-by: Cursor <cursoragent@cursor.com>
</commit_message>
<xml_diff>
--- a/sparse-calibration-kt/manuscript-pack/manuscript/Reproducible Sparse-Concept and Calibration Diagnostics for Knowledge Tracing.docx
+++ b/sparse-calibration-kt/manuscript-pack/manuscript/Reproducible Sparse-Concept and Calibration Diagnostics for Knowledge Tracing.docx
@@ -22696,7 +22696,7 @@
     <w:p>
       <w:pPr>
         <w:pStyle w:val="Text"/>
-        <w:spacing w:line="252" w:lineRule="exact"/>
+        <w:spacing w:line="224" w:lineRule="exact"/>
       </w:pPr>
       <w:r>
         <w:t>This study is a secondary analysis of three publicly released, de-identified educational benchmark datasets: ASSISTments 2012, Junyi Academy, and XES3G5M. The records were de-identified by the original dataset providers before release. The research team did not recruit new participants, including students, teachers, or minors, did not contact learners or their parents or guardians, and did not conduct a classroom intervention. The team did not collect new written consent, new log files, or video recordings. The research team did not collect new personal data, access direct personal identifiers, or attempt to re-identify any learner. The Junyi Academy dump is used under the provider’s CC BY-NC-SA 4.0 terms. The study is not an industry-partnered data collection, and no EdTech company commissioned the analysis. Under the institutional policy of Hung Yen University of Technology and Engineering, this secondary analysis does not require prospective human-subjects ethics review, and no institutional ethics protocol number applies. Data handling was limited to those publicly released, provider-de-identified records. Where the GDPR, FERPA, or another regional data-protection law applies to the source data and its jurisdiction, this handling is the stated basis of compliance.</w:t>
@@ -22713,7 +22713,7 @@
     <w:p>
       <w:pPr>
         <w:pStyle w:val="Text"/>
-        <w:spacing w:line="252" w:lineRule="exact"/>
+        <w:spacing w:line="224" w:lineRule="exact"/>
         <w:rPr>
           <w:noProof/>
         </w:rPr>

</xml_diff>

<commit_message>
Align the IJIET submission files with the template and the locked blind manuscript.
Co-authored-by: Cursor <cursoragent@cursor.com>
</commit_message>
<xml_diff>
--- a/sparse-calibration-kt/manuscript-pack/manuscript/Reproducible Sparse-Concept and Calibration Diagnostics for Knowledge Tracing.docx
+++ b/sparse-calibration-kt/manuscript-pack/manuscript/Reproducible Sparse-Concept and Calibration Diagnostics for Knowledge Tracing.docx
@@ -231,9 +231,21 @@
       </w:pPr>
       <w:r>
         <w:rPr>
-          <w:i/>
+          <w:rFonts w:ascii="Times New Roman" w:hAnsi="Times New Roman" w:cs="Times New Roman" w:eastAsia="Times New Roman"/>
+          <w:b w:val="1"/>
+          <w:i w:val="1"/>
+          <w:sz w:val="18"/>
         </w:rPr>
-        <w:t>Abstract—Knowledge Tracing (KT) systems that skip, remediate, or advance practice typically consume a predicted probability rather than an area-under-the-curve (AUC) score, so population ranking can look acceptable while observed calibration error can be larger on rarely practiced knowledge components (KCs). This paper presents a train-only sparse-concept and calibration diagnostic protocol with learner-based primary reporting over four unique learner partitions, occupancy-aware strata, 15-bin expected calibration error (ECE), Brier score, reliability diagrams, and a seven-channel leakage audit. It is not a new KT architecture. The protocol is applied to three public logs (ASSISTments 2012, Junyi Academy, and XES3G5M) with item response theory (IRT), Deep Knowledge Tracing (DKT), and a local Transformer reference model (T-KT). On ASSISTments 2012, dense-to-sparse ECE rises for both a local Transformer reference (T-KT: 0.114 to 0.228) and the official SimpleKT checkpoint (0.020 to 0.088) on the same Limited-support sparse stratum (N ≈ 415), so the same dense-to-sparse direction is not unique to the local T-KT reference. Junyi yields no learner-based sparse stratum under the operational content identifier, and XES3G5M does not show the same adverse dense-to-sparse ECE gradient (observed 0.1176, 0.1129, 0.1254; interpreted descriptively). A frozen accompanying artifact rebuilds the reported diagnostic tables from archived summaries. This is a protocol evaluation, not a classroom intervention.</w:t>
+        <w:t>Abstract</w:t>
+      </w:r>
+      <w:r>
+        <w:rPr>
+          <w:rFonts w:ascii="Times New Roman" w:hAnsi="Times New Roman" w:cs="Times New Roman" w:eastAsia="Times New Roman"/>
+          <w:b w:val="1"/>
+          <w:i w:val="0"/>
+          <w:sz w:val="18"/>
+        </w:rPr>
+        <w:t>—Knowledge Tracing (KT) systems that skip, remediate, or advance practice typically consume a predicted probability rather than an area-under-the-curve (AUC) score, so population ranking can look acceptable while observed calibration error can be larger on rarely practiced knowledge components (KCs). This paper presents a train-only sparse-concept and calibration diagnostic protocol with learner-based primary reporting over four unique learner partitions, occupancy-aware strata, 15-bin expected calibration error (ECE), Brier score, reliability diagrams, and a seven-channel leakage audit. It is not a new KT architecture. The protocol is applied to three public logs (ASSISTments 2012, Junyi Academy, and XES3G5M) with item response theory (IRT), Deep Knowledge Tracing (DKT), and a local Transformer reference model (T-KT). On ASSISTments 2012, dense-to-sparse ECE rises for both a local Transformer reference (T-KT: 0.114 to 0.228) and the official SimpleKT checkpoint (0.020 to 0.088) on the same Limited-support sparse stratum (N ≈ 415), so the same dense-to-sparse direction is not unique to the local T-KT reference. Junyi yields no learner-based sparse stratum under the operational content identifier, and XES3G5M does not show the same adverse dense-to-sparse ECE gradient (observed 0.1176, 0.1129, 0.1254; interpreted descriptively). A frozen accompanying artifact rebuilds the reported diagnostic tables from archived summaries. This is a protocol evaluation, not a classroom intervention.</w:t>
       </w:r>
     </w:p>
     <w:p>
@@ -247,9 +259,21 @@
       <w:bookmarkStart w:id="0" w:name="PointTmp"/>
       <w:r>
         <w:rPr>
-          <w:i/>
+          <w:rFonts w:ascii="Times New Roman" w:hAnsi="Times New Roman" w:cs="Times New Roman" w:eastAsia="Times New Roman"/>
+          <w:b w:val="1"/>
+          <w:i w:val="1"/>
+          <w:sz w:val="18"/>
         </w:rPr>
-        <w:t>Keywords—knowledge tracing, calibration, sparse concepts, learning analytics, evaluation protocol, leakage audit</w:t>
+        <w:t>Keywords</w:t>
+      </w:r>
+      <w:r>
+        <w:rPr>
+          <w:rFonts w:ascii="Times New Roman" w:hAnsi="Times New Roman" w:cs="Times New Roman" w:eastAsia="Times New Roman"/>
+          <w:b w:val="1"/>
+          <w:i w:val="0"/>
+          <w:sz w:val="18"/>
+        </w:rPr>
+        <w:t>—knowledge tracing, calibration, sparse concepts, learning analytics, evaluation protocol, leakage audit</w:t>
       </w:r>
     </w:p>
     <w:bookmarkEnd w:id="0"/>
@@ -484,7 +508,7 @@
         <w:t>[10]</w:t>
       </w:r>
       <w:r>
-        <w:t xml:space="preserve"> are related literature only; they are not trained or scored here and are reserved for later studies.</w:t>
+        <w:t xml:space="preserve"> are related literature but are outside the scope of the present diagnostic study.</w:t>
       </w:r>
     </w:p>
     <w:p>
@@ -1379,7 +1403,7 @@
         <w:spacing w:line="252" w:lineRule="exact"/>
       </w:pPr>
       <w:r>
-        <w:t>Main tables use local IRT, DKT, and a local Transformer reference model (T-KT). The original training-container commit is NOT RECOVERED and is not imputed. Source bytes are recorded at a commit hash listed in the accompanying artifact. The local Transformer reference is a two-layer Transformer encoder over DKT-style KC-response tokens. T-KT is used as a local reference model to stress-test the diagnostic protocol; it is not the published SimpleKT architecture and is not intended to represent Transformer-based KT models generally. Official SimpleKT [4] is scored on ASSISTments AUC/ECE only, as an external ASSISTments check of whether the observed dense-to-sparse ECE direction is unique to the local T-KT reference. Table 2 reports recovered training settings; missing fields are marked NOT RECOVERED and are not imputed.</w:t>
+        <w:t>Main tables use local IRT, DKT, and a local Transformer reference model (T-KT). The original training-container commit is NOT RECOVERED and is not imputed. The local Transformer reference is a two-layer Transformer encoder over DKT-style KC-response tokens. T-KT is used as a local reference model to stress-test the diagnostic protocol; it is not the published SimpleKT architecture and is not intended to represent Transformer-based KT models generally. Official SimpleKT [4] is scored on ASSISTments AUC/ECE only, as an external ASSISTments check of whether the observed dense-to-sparse ECE direction is unique to the local T-KT reference. Table 2 reports recovered training settings; missing fields are marked NOT RECOVERED and are not imputed.</w:t>
       </w:r>
     </w:p>
     <w:p>
@@ -5591,20 +5615,6 @@
       <w:r>
         <w:t>On XES3G5M, sparse-stratum AUC is higher than dense-stratum AUC (DKT 0.858 versus 0.818; T-KT 0.847 versus 0.752; Reliable occupancy). Lower training frequency is therefore not a universal ranking failure. Junyi’s learner-based sparse bucket is empty under the pre-specified cuts—a protocol outcome, not a missing cell and not a zero-ECE claim.</w:t>
       </w:r>
-    </w:p>
-    <w:p>
-      <w:pPr>
-        <w:rPr>
-          <w:sz w:val="2"/>
-        </w:rPr>
-        <w:sectPr>
-          <w:type w:val="continuous"/>
-          <w:pgSz w:w="11907" w:h="16839" w:code="9"/>
-          <w:pgMar w:top="1009" w:right="936" w:bottom="1009" w:left="936" w:header="431" w:footer="431" w:gutter="0"/>
-          <w:cols w:num="2" w:space="288"/>
-          <w:docGrid w:linePitch="272"/>
-        </w:sectPr>
-      </w:pPr>
     </w:p>
     <w:p>
       <w:pPr>
@@ -11712,45 +11722,6 @@
     </w:p>
     <w:p>
       <w:pPr>
-        <w:sectPr>
-          <w:type w:val="continuous"/>
-          <w:pgSz w:w="11907" w:h="16839" w:code="9"/>
-          <w:pgMar w:top="1009" w:right="936" w:bottom="1009" w:left="936" w:header="431" w:footer="431" w:gutter="0"/>
-          <w:cols w:num="2" w:space="288"/>
-          <w:docGrid w:linePitch="272"/>
-        </w:sectPr>
-      </w:pPr>
-    </w:p>
-    <w:p>
-      <w:pPr>
-        <w:rPr>
-          <w:sz w:val="2"/>
-        </w:rPr>
-        <w:sectPr>
-          <w:type w:val="continuous"/>
-          <w:pgSz w:w="11907" w:h="16839" w:code="9"/>
-          <w:pgMar w:top="1009" w:right="936" w:bottom="1009" w:left="936" w:header="431" w:footer="431" w:gutter="0"/>
-          <w:cols w:space="288"/>
-          <w:docGrid w:linePitch="272"/>
-        </w:sectPr>
-      </w:pPr>
-    </w:p>
-    <w:p>
-      <w:pPr>
-        <w:rPr>
-          <w:sz w:val="2"/>
-        </w:rPr>
-        <w:sectPr>
-          <w:type w:val="continuous"/>
-          <w:pgSz w:w="11907" w:h="16839" w:code="9"/>
-          <w:pgMar w:top="1009" w:right="936" w:bottom="1009" w:left="936" w:header="431" w:footer="431" w:gutter="0"/>
-          <w:cols w:num="2" w:space="288"/>
-          <w:docGrid w:linePitch="272"/>
-        </w:sectPr>
-      </w:pPr>
-    </w:p>
-    <w:p>
-      <w:pPr>
         <w:pStyle w:val="Heading2"/>
         <w:numPr>
           <w:ilvl w:val="0"/>
@@ -11769,86 +11740,6 @@
       <w:r>
         <w:t>A locked gate at τ=0.7 is a simulated next-response decision-error probe, not RQ3. On ASSISTments 2012, T-KT FAR is 0.196 on dense KCs and 0.268 on sparse KCs (ΔFAR = +0.072; seed 42; KC-clustered percentile bootstrap 95% CI [0.006, 0.138], B = 2000), and ΔFAR is positive in 4/4 unique learner partitions (partition-level mean 0.056). For DKT the same probe is positive in only 3 of 4 unique partitions (Table A3; five-run count 3/5 is a different unit), so the stratum difference in gate error is not uniform across backbones; the lower confidence bound for T-KT is close to zero, and we therefore report the direction of ΔFAR, not its robustness. On XES3G5M the same T-KT probe points the other way: ΔFAR is negative in all 4/4 unique learner partitions (partition-level mean ΔFAR = −0.019; five-run mean −0.017; sparse N mean 1,957 (five-run gate; not the four-partition ECE N=1,969); accompanying artifact). ASSISTments FAR denominators and partition-level summaries are reported in Tables A2–A3; the occupancy-policy counterfactual remains in the accompanying artifact; the τ-grid is Table A6.</w:t>
       </w:r>
-    </w:p>
-    <w:p>
-      <w:pPr>
-        <w:pStyle w:val="Text"/>
-        <w:sectPr>
-          <w:type w:val="continuous"/>
-          <w:pgSz w:w="11907" w:h="16839" w:code="9"/>
-          <w:pgMar w:top="1009" w:right="936" w:bottom="1009" w:left="936" w:header="431" w:footer="431" w:gutter="0"/>
-          <w:cols w:num="2" w:space="288"/>
-          <w:docGrid w:linePitch="272"/>
-        </w:sectPr>
-      </w:pPr>
-    </w:p>
-    <w:p>
-      <w:pPr>
-        <w:rPr>
-          <w:sz w:val="2"/>
-        </w:rPr>
-        <w:sectPr>
-          <w:type w:val="continuous"/>
-          <w:pgSz w:w="11907" w:h="16839" w:code="9"/>
-          <w:pgMar w:top="1009" w:right="936" w:bottom="1009" w:left="936" w:header="431" w:footer="431" w:gutter="0"/>
-          <w:cols w:space="288"/>
-          <w:docGrid w:linePitch="272"/>
-        </w:sectPr>
-      </w:pPr>
-    </w:p>
-    <w:p>
-      <w:pPr>
-        <w:pStyle w:val="Text"/>
-        <w:sectPr>
-          <w:type w:val="continuous"/>
-          <w:pgSz w:w="11907" w:h="16839" w:code="9"/>
-          <w:pgMar w:top="1009" w:right="936" w:bottom="1009" w:left="936" w:header="431" w:footer="431" w:gutter="0"/>
-          <w:cols w:space="288"/>
-          <w:docGrid w:linePitch="272"/>
-        </w:sectPr>
-      </w:pPr>
-    </w:p>
-    <w:p>
-      <w:pPr>
-        <w:rPr>
-          <w:sz w:val="2"/>
-        </w:rPr>
-        <w:sectPr>
-          <w:type w:val="continuous"/>
-          <w:pgSz w:w="11907" w:h="16839" w:code="9"/>
-          <w:pgMar w:top="1009" w:right="936" w:bottom="1009" w:left="936" w:header="431" w:footer="431" w:gutter="0"/>
-          <w:cols w:space="288"/>
-          <w:docGrid w:linePitch="272"/>
-        </w:sectPr>
-      </w:pPr>
-    </w:p>
-    <w:p>
-      <w:pPr>
-        <w:rPr>
-          <w:sz w:val="2"/>
-        </w:rPr>
-        <w:sectPr>
-          <w:type w:val="continuous"/>
-          <w:pgSz w:w="11907" w:h="16839" w:code="9"/>
-          <w:pgMar w:top="1009" w:right="936" w:bottom="1009" w:left="936" w:header="431" w:footer="431" w:gutter="0"/>
-          <w:cols w:num="2" w:space="288"/>
-          <w:docGrid w:linePitch="272"/>
-        </w:sectPr>
-      </w:pPr>
-    </w:p>
-    <w:p>
-      <w:pPr>
-        <w:rPr>
-          <w:sz w:val="2"/>
-        </w:rPr>
-        <w:sectPr>
-          <w:type w:val="continuous"/>
-          <w:pgSz w:w="11907" w:h="16839" w:code="9"/>
-          <w:pgMar w:top="1009" w:right="936" w:bottom="1009" w:left="936" w:header="431" w:footer="431" w:gutter="0"/>
-          <w:cols w:num="2" w:space="288"/>
-          <w:docGrid w:linePitch="272"/>
-        </w:sectPr>
-      </w:pPr>
     </w:p>
     <w:p>
       <w:pPr>
@@ -11978,7 +11869,7 @@
         <w:spacing w:line="252" w:lineRule="exact"/>
       </w:pPr>
       <w:r>
-        <w:t>Under the evaluated conditions, KT models can exhibit larger observed calibration error on sparse KCs in some dataset-model settings even when aggregate AUC appears adequate. That ECE association appears for T-KT on ASSISTments 2012 (Limited sparse support). It is not reported for Junyi’s empty learner-based sparse bucket. XES3G5M T-KT ECE does not show the same adverse dense-to-sparse gradient as ASSISTments (0.1176 / 0.1129 / 0.1254, descriptive); XES DKT calibration does not follow that T-KT pattern. The train-only strata, leakage checklist, and per-stratum ECE/Brier diagnostics are therefore conditionally useful. Graph and contrastive KT, and any path or distillation module, are left to later studies. This paper is a protocol and calibration diagnostic, not a new KT model and not a classroom intervention.</w:t>
+        <w:t>Under the evaluated conditions, KT models can exhibit larger observed calibration error on sparse KCs in some dataset-model settings even when aggregate AUC appears adequate. That ECE association appears for T-KT on ASSISTments 2012 (Limited sparse support). It is not reported for Junyi’s empty learner-based sparse bucket. XES3G5M T-KT ECE does not show the same adverse dense-to-sparse gradient as ASSISTments (0.1176 / 0.1129 / 0.1254, descriptive); XES DKT calibration does not follow that T-KT pattern. The train-only strata, leakage checklist, and per-stratum ECE/Brier diagnostics are therefore conditionally useful. Methodological extensions beyond the present diagnostic protocol are outside the scope of this study. This paper is a protocol and calibration diagnostic, not a new KT model and not a classroom intervention.</w:t>
       </w:r>
     </w:p>
     <w:p>
@@ -23118,7 +23009,7 @@
         <w:pStyle w:val="References"/>
       </w:pPr>
       <w:r>
-        <w:t>X. Yan, C. Tang, and A. Shimada, “Recovering Stranded Discrimination in Knowledge Tracing: Per-Item Bias Correction via Empirical-Bayes Shrinkage,” in Machine Learning and Knowledge Discovery in Databases. Research Track, Proc. Eur. Conf. Mach. Learn. Knowl. Discov. Databases (ECML PKDD), Lecture Notes in Computer Science. Springer, 2026, pp. 586–602. doi: 10.1007/978-3-032-37673-2_33</w:t>
+        <w:t>X. Yan, C. Tang, and A. Shimada, “Recovering Stranded Discrimination in Knowledge Tracing: Per-Item Bias Correction via Empirical-Bayes Shrinkage,” in Machine Learning and Knowledge Discovery in Databases. Research Track, Proc. Eur. Conf. Mach. Learn. Knowl. Discov. Databases (ECML PKDD), Lecture Notes in Computer Science, vol. 16946. Springer, 2026, pp. 586–602. doi: 10.1007/978-3-032-37673-2_33</w:t>
       </w:r>
     </w:p>
     <w:p>

</xml_diff>

<commit_message>
State each diagnostic limit once and correct the limitations clause.
Co-authored-by: Cursor <cursoragent@cursor.com>
</commit_message>
<xml_diff>
--- a/sparse-calibration-kt/manuscript-pack/manuscript/Reproducible Sparse-Concept and Calibration Diagnostics for Knowledge Tracing.docx
+++ b/sparse-calibration-kt/manuscript-pack/manuscript/Reproducible Sparse-Concept and Calibration Diagnostics for Knowledge Tracing.docx
@@ -245,7 +245,7 @@
           <w:i w:val="0"/>
           <w:sz w:val="18"/>
         </w:rPr>
-        <w:t>—Knowledge Tracing (KT) systems that skip, remediate, or advance practice typically consume a predicted probability rather than an area-under-the-curve (AUC) score, so population ranking can look acceptable while observed calibration error can be larger on rarely practiced knowledge components (KCs). This paper presents a train-only sparse-concept and calibration diagnostic protocol with learner-based primary reporting over four unique learner partitions, occupancy-aware strata, 15-bin expected calibration error (ECE), Brier score, reliability diagrams, and a seven-channel leakage audit. It is not a new KT architecture. The protocol is applied to three public logs (ASSISTments 2012, Junyi Academy, and XES3G5M) with item response theory (IRT), Deep Knowledge Tracing (DKT), and a local Transformer reference model (T-KT). On ASSISTments 2012, dense-to-sparse ECE rises for both a local Transformer reference (T-KT: 0.114 to 0.228) and the official SimpleKT checkpoint (0.020 to 0.088) on the same Limited-support sparse stratum (N ≈ 415), so the same dense-to-sparse direction is not unique to the local T-KT reference. Junyi yields no learner-based sparse stratum under the operational content identifier, and XES3G5M does not show the same adverse dense-to-sparse ECE gradient (observed 0.1176, 0.1129, 0.1254; interpreted descriptively). A frozen accompanying artifact rebuilds the reported diagnostic tables from archived summaries. This is a protocol evaluation, not a classroom intervention.</w:t>
+        <w:t>—Knowledge Tracing (KT) systems that skip, remediate, or advance practice typically consume a predicted probability rather than an area-under-the-curve (AUC) score, so population ranking can look acceptable while observed calibration error can be larger on rarely practiced knowledge components (KCs). This paper presents a train-only sparse-concept and calibration diagnostic protocol with learner-based primary reporting over four unique learner partitions, occupancy-aware strata, 15-bin expected calibration error (ECE), Brier score, reliability diagrams, and a seven-channel leakage audit. The protocol is applied to three public logs (ASSISTments 2012, Junyi Academy, and XES3G5M) with item response theory (IRT), Deep Knowledge Tracing (DKT), and a local Transformer reference model (T-KT). On ASSISTments 2012, dense-to-sparse ECE rises for both a local Transformer reference (T-KT: 0.114 to 0.228) and the official SimpleKT checkpoint (0.020 to 0.088) on the same Limited-support sparse stratum (N ≈ 415), so the same dense-to-sparse direction is not unique to the local T-KT reference. Junyi yields no learner-based sparse stratum under the operational content identifier, and XES3G5M does not show the same adverse dense-to-sparse ECE gradient (observed 0.1176, 0.1129, 0.1254; Section IV.B). A frozen accompanying artifact rebuilds the reported diagnostic tables from archived summaries.</w:t>
       </w:r>
     </w:p>
     <w:p>
@@ -368,7 +368,7 @@
         <w:spacing w:line="252" w:lineRule="exact"/>
       </w:pPr>
       <w:r>
-        <w:t>The empirical answers are bounded. Lower KC training frequency does not universally degrade discrimination: on XES3G5M, sparse AUC is higher than dense AUC for DKT and T-KT. Some dataset–model settings exhibit larger observed calibration error on sparse KCs. On ASSISTments 2012, T-KT ECE increases from dense to sparse KCs (Limited sparse support, Section IV.D). On Junyi the learner-based sparse ECE contrast is undefined (empty bucket), not a claim that ECE is flat; T-KT still rises from dense to medium (Section IV.B). XES3G5M does not show the same adverse dense-to-sparse ECE gradient observed on ASSISTments; the observed 0.1176 / 0.1129 / 0.1254 difference is small in magnitude relative to the ASSISTments contrast and is interpreted descriptively. Two alternative train-only frequency cut grids leave that ASSISTments T-KT rise positive (Table A1). A locked gate at τ=0.7 is a simulated decision-error probe (Tables A2–A3), not RQ3. We therefore do not claim that sparse KCs always fail, and we do not claim a causal effect of training frequency on calibration.</w:t>
+        <w:t>The empirical answers are bounded. Lower KC training frequency does not universally degrade discrimination: on XES3G5M, sparse AUC is higher than dense AUC for DKT and T-KT. Some dataset–model settings exhibit larger observed calibration error on sparse KCs. On ASSISTments 2012, T-KT ECE increases from dense to sparse KCs (Limited sparse support, Section IV.D). On Junyi the learner-based sparse bucket is empty, so the sparse ECE contrast is undefined. T-KT still rises from dense to medium (Section IV.B). XES3G5M does not show the same adverse dense-to-sparse ECE gradient observed on ASSISTments. The observed 0.1176 / 0.1129 / 0.1254 difference is small relative to the ASSISTments contrast (Section IV.B). Two alternative train-only frequency cut grids leave that ASSISTments T-KT rise positive (Table A1). A locked gate at τ=0.7 is a simulated decision-error probe (Tables A2–A3), not RQ3. We therefore do not claim that sparse KCs always fail, and we do not claim a causal effect of training frequency on calibration.</w:t>
       </w:r>
     </w:p>
     <w:p>
@@ -377,11 +377,10 @@
         <w:spacing w:line="252" w:lineRule="exact"/>
       </w:pPr>
       <w:r>
-        <w:t xml:space="preserve">Contributions are conservative. (i) A train-only sparse-concept and cold-start evaluation protocol with learner-based primary reporting, occupancy-aware strata, and an explicit seven-channel (L1–L7) leakage audit applied per dataset and per fold. (ii) Per-stratum ECE, Brier, and reliability diagnostics that yield dataset-dependent calibration warnings, not a universal sparse-KC law. (iii) An audit-ready artifact that rebuilds the reported diagnostic tables from frozen summaries. Here, reproducibility refers to re-derivation of the reported diagnostic tables from frozen summaries and audit artifacts; it does not denote recreation of historical model-training containers. We do not propose a </w:t>
-      </w:r>
-      <w:r>
-        <w:lastRenderedPageBreak/>
-        <w:t>new KT architecture, a new calibration algorithm, or a classroom intervention. Graph and contrastive KT models are out of scope and are not scored.</w:t>
+        <w:t xml:space="preserve">Contributions are conservative. (i) A train-only sparse-concept and cold-start evaluation protocol with learner-based primary reporting, occupancy-aware strata, and an explicit seven-channel (L1–L7) leakage audit applied per dataset and per fold. (ii) Per-stratum ECE, Brier, and reliability diagnostics that yield dataset-dependent calibration warnings, not a universal sparse-KC law. (iii) An audit-ready artifact that rebuilds the reported diagnostic tables from frozen summaries. Here, reproducibility refers to re-derivation of the reported diagnostic tables from frozen summaries and audit artifacts; it does not denote recreation of historical model-training containers. </w:t>
+      </w:r>
+      <w:r>
+        <w:t>Graph and contrastive KT models are out of scope and are not scored.</w:t>
       </w:r>
     </w:p>
     <w:p>
@@ -556,7 +555,7 @@
         <w:spacing w:line="252" w:lineRule="exact"/>
       </w:pPr>
       <w:r>
-        <w:t xml:space="preserve">These four problems are not interchangeable. sparseKT-style sparse attention is not equivalent to low-frequency KCs: attention can be sparsified on a frequently practiced skill. New-student cold start is not the same as concept-level zero-frequency cold start: a previously </w:t>
+        <w:t xml:space="preserve">These four problems are not interchangeable. This protocol scores low-frequency KCs. Sparse attention can still be applied to a frequently practiced skill. New-student cold start is not the same as concept-level zero-frequency cold start: a previously </w:t>
       </w:r>
       <w:r>
         <w:t>observed learner may still encounter a concept that never appeared in the training fold. The protocol in Section III operationalizes (2) and (4) through train-only KC-frequency strata with an explicit strict cold-start group (f=0).</w:t>
@@ -2606,14 +2605,10 @@
         <w:t>[1]</w:t>
       </w:r>
       <w:r>
-        <w:t xml:space="preserve"> but is not a scored baseline; IRT 1PL is the low-cost classical reference. T-KT is not official SimpleKT </w:t>
-      </w:r>
-      <w:r>
-        <w:t>[4]</w:t>
-      </w:r>
-      <w:r>
-        <w:t>.</w:t>
-      </w:r>
+        <w:t xml:space="preserve"> but is not a scored baseline; IRT 1PL is the low-cost classical reference.</w:t>
+      </w:r>
+      <w:r/>
+      <w:r/>
     </w:p>
     <w:p>
       <w:pPr>
@@ -2670,7 +2665,7 @@
         <w:spacing w:before="80" w:after="40"/>
       </w:pPr>
       <w:r>
-        <w:t>Fig. 1. Reproducible sparse-concept and calibration diagnostic pipeline. Tags L1–L7 match Table 3. L3 — KC map / Q-matrix: static platform-provided mapping (the figure box reads KC map). L5: no test-fit map; L6: no test-based model selection; L7: f_train=0. Not a new KT architecture.</w:t>
+        <w:t>Fig. 1. Reproducible sparse-concept and calibration diagnostic pipeline. Tags L1–L7 match Table 3. L3 — KC map / Q-matrix: static platform-provided mapping (the figure box reads KC map). L5: no test-fit map; L6: no test-based model selection; L7: f_train=0.</w:t>
       </w:r>
     </w:p>
     <w:p>
@@ -3954,7 +3949,7 @@
         <w:spacing w:line="252" w:lineRule="exact"/>
       </w:pPr>
       <w:r>
-        <w:t>Under the learner-disjoint split every test learner is unseen at training time, so in our implementation the IRT column reduces by construction to a global training base-rate predictor and its AUC is exactly 0.5000; item difficulty β is estimated during training but is not used at prediction time for unseen learners. We therefore report IRT as a base-rate reference, not as a ranking competitor. This is a property of our implementation choice, not of item-response theory.</w:t>
+        <w:t>Under the learner-disjoint split every test learner is unseen at training time, so in our implementation the IRT column reduces by construction to a global training base-rate predictor and its AUC is exactly 0.5000; item difficulty β is estimated during training but is not used at prediction time for unseen learners. We report it as a base-rate reference. The result is specific to this implementation, not to item-response theory in general.</w:t>
       </w:r>
     </w:p>
     <w:p>
@@ -5650,7 +5645,7 @@
         <w:spacing w:line="252" w:lineRule="exact"/>
       </w:pPr>
       <w:r>
-        <w:t>Calibration does not universally worsen. On Junyi Academy the learner-based sparse bucket is empty; only dense and medium exist, and T-KT ECE rises from 0.0817±0.0070 to 0.1136±0.0155 (same scored N as DKT/IRT after aligning T-KT exports to official learner partitions; Fig. 3). On XES3G5M, T-KT ECE does not show the same adverse dense-to-sparse gradient as ASSISTments: the observed values 0.1176, 0.1129, and 0.1254 differ by a small amount relative to the ASSISTments contrast, despite Reliable sparse occupancy (N=1,969), and T-KT Brier is not worse on sparse than dense (0.149 vs 0.156); that difference is interpreted descriptively. DKT on the same XES partitions is not a counter-pattern: ECE, Brier, and REL all rise from dense to sparse (Table A4b). A descriptive ECE pattern is not a license to skip occupancy reporting and is not the same as a flat FPR.</w:t>
+        <w:t>Calibration does not universally worsen. On Junyi Academy the learner-based sparse bucket is empty. Only dense and medium exist. T-KT ECE rises from 0.0817±0.0070 to 0.1136±0.0155 (same scored N as DKT/IRT after aligning T-KT exports to official learner partitions; Fig. 3). On XES3G5M, T-KT ECE does not show the same adverse dense-to-sparse gradient as ASSISTments. The observed values are 0.1176, 0.1129, and 0.1254. They differ by a small amount relative to the ASSISTments contrast, despite Reliable sparse occupancy (N=1,969). T-KT Brier is not worse on sparse than dense (0.149 vs 0.156). That difference is interpreted descriptively. DKT on the same XES partitions is not a counter-pattern: ECE, Brier, and REL all rise from dense to sparse (Table A4b). Occupancy is still reported with that pattern. It is not a flat FPR.</w:t>
       </w:r>
     </w:p>
     <w:p>
@@ -11772,7 +11767,7 @@
         <w:spacing w:line="252" w:lineRule="exact"/>
       </w:pPr>
       <w:r>
-        <w:t>Two empirical regularities, not laws, structure the results. First, training frequency is not a universal predictor of AUC failure: on XES3G5M, sparse-stratum AUC is higher than dense-stratum AUC for DKT and T-KT (Reliable occupancy), and Junyi’s learner-based sparse bucket is empty (exercise-level operational identifier, ucid) rather than a ranking collapse. Second, the observed sparse-stratum calibration pattern is dataset- and model-dependent. ASSISTments 2012 T-KT ECE is associated with a dense-to-sparse rise under Limited sparse support (Table 5, N=415); XES3G5M T-KT ECE does not show the same adverse dense-to-sparse gradient as ASSISTments (0.1176 / 0.1129 / 0.1254, interpreted descriptively) despite Reliable sparse occupancy, while XES DKT ECE/Brier/REL worsen. Calibration is not guaranteed to worsen as frequency falls. As a secondary operational probe, a locked next-response gate can differ by frequency stratum: ASSISTments T-KT ΔFAR is positive in 4/4 unique partitions (direction only; seed-42 95% CI [0.006, 0.138]), DKT is positive in only 3/4 unique partitions (Table A3), and the XES3G5M T-KT probe points the other way, with ΔFAR negative in all 4/4 unique learner partitions (partition-level mean −0.019; five-run mean −0.017; accompanying artifact; ASSISTments denominators in Tables A2–A3).</w:t>
+        <w:t>Two empirical regularities, not laws, structure the results. First, training frequency is not a universal predictor of AUC failure: on XES3G5M, sparse-stratum AUC is higher than dense-stratum AUC for DKT and T-KT (Reliable occupancy), and Junyi’s learner-based sparse bucket is empty (exercise-level operational identifier, ucid) rather than a ranking collapse. Second, the observed sparse-stratum calibration pattern is dataset- and model-dependent. ASSISTments 2012 T-KT ECE is associated with a dense-to-sparse rise under Limited sparse support (Table 5, N=415); XES3G5M T-KT ECE does not show the same adverse dense-to-sparse gradient as ASSISTments (0.1176 / 0.1129 / 0.1254; Section IV.B) despite Reliable sparse occupancy, while XES DKT ECE/Brier/REL worsen. Calibration is not guaranteed to worsen as frequency falls. As a secondary operational probe, a locked next-response gate can differ by frequency stratum: ASSISTments T-KT ΔFAR is positive in 4/4 unique partitions (direction only; seed-42 95% CI [0.006, 0.138]), DKT is positive in only 3/4 unique partitions (Table A3), and the XES3G5M T-KT probe points the other way, with ΔFAR negative in all 4/4 unique learner partitions (partition-level mean −0.019; five-run mean −0.017; accompanying artifact; ASSISTments denominators in Tables A2–A3).</w:t>
       </w:r>
     </w:p>
     <w:p>
@@ -11793,7 +11788,7 @@
         <w:spacing w:line="252" w:lineRule="exact"/>
       </w:pPr>
       <w:r>
-        <w:t xml:space="preserve">Educational-technology gates that skip, remediate, or advance practice consume a predicted probability, not a population AUC. A ranking win can therefore hide miscalibration on rarely practiced KCs. This subsection is a pre-deployment evaluation checklist for that probability-to-decision chain; it is not a classroom policy, not a recommended production threshold, and not evidence from a classroom RCT. Four checks precede any operational reading of a single global threshold. (1) Occupancy: inspect train-only KC-frequency occupancy on the training fold actually used, and report empty or low-support strata. (2) Calibration: evaluate ECE and Brier/reliability by stratum rather than relying only on population AUC. (3) Threshold decision error: if a fixed probability gate is evaluated, report FAR and FPR with their denominators. FAR = P(y=0 | p≥τ) and equals 1 − precision among advance decisions; FPR = P(p≥τ | y=0). (4) Leakage/evaluation hygiene: before operational interpretation, verify the relevant L1–L7 decisions, especially train-only stratum assignment, no test-fitted calibration map, no test-based model selection, and a cold-start definition from training frequency. Reliable/Limited/Insufficient flags remain descriptive sample-support labels, not inferential guarantees. This study does not apply temperature scaling </w:t>
+        <w:t xml:space="preserve">Educational-technology gates that skip, remediate, or advance practice consume a predicted probability, not a population AUC. A ranking win can therefore hide miscalibration on rarely practiced KCs. This subsection is a pre-deployment evaluation checklist for that probability-to-decision chain, not a recommended production threshold. Four checks precede any operational reading of a single global threshold. (1) Occupancy: inspect train-only KC-frequency occupancy on the training fold actually used, and report empty or low-support strata. (2) Calibration: evaluate ECE and Brier/reliability by stratum rather than relying only on population AUC. (3) Threshold decision error: if a fixed probability gate is evaluated, report FAR and FPR with their denominators. FAR = P(y=0 | p≥τ) and equals 1 − precision among advance decisions; FPR = P(p≥τ | y=0). (4) Leakage/evaluation hygiene: before operational interpretation, verify the relevant L1–L7 decisions, especially train-only stratum assignment, no test-fitted calibration map, no test-based model selection, and a cold-start definition from training frequency. Reliable/Limited/Insufficient flags remain descriptive sample-support labels, not inferential guarantees. This study does not apply temperature scaling </w:t>
       </w:r>
       <w:r>
         <w:t>[16]</w:t>
@@ -11847,7 +11842,7 @@
         <w:spacing w:line="252" w:lineRule="exact"/>
       </w:pPr>
       <w:r>
-        <w:t>Next-response correctness is not latent mastery: y=0 is an incorrect next attempt, not a latent-skill diagnosis. The threshold gate is a simulated probe, not a classroom policy. There is no classroom RCT. We do not train graph, contrastive, or self-supervised KT models. BKT is not a scored baseline because pyBKT 1.4.1 produced a degenerate fit on the tested ASSISTments seed-42 configuration (reported in the accompanying artifact). IRT is the classical reference. T-KT is a local Transformer reference used to stress-test the protocol; it is not the published SimpleKT architecture [4] and is not intended to represent Transformer-based KT models generally. Official SimpleKT is an external ASSISTments check of whether the observed dense-to-sparse ECE direction is unique to the local T-KT reference. Temporal evaluation uses a single corrected cutoff (seed 42). Seeds 2025 and 2026 share a split. R/L/I are descriptive support flags. ECE depends on binning. We do not report size-matched or cluster-bootstrap confidence intervals for primary stratum ΔECE; those calibration contrasts are interpreted descriptively, and because Table A1 also shows ΔECE shrinking as sparse N grows, we interpret the sign of the dense-to-sparse ECE contrast, not its magnitude [26], [27]. Three datasets cannot establish a universal diagnostic law. We evaluate Junyi at the ucid level only; other concept granularities in that dump are not assessed and are left to future work. The reported diagnostics are reproduced from the frozen accompanying artifact submitted with this manuscript. Locked ASSISTments T-KT ECE cells and the accompanying artifact stratum-AUC and baseline-inventory tables rebuild from frozen summaries (scripts/rebuild_locked_tables.sh); that command does not retrain models and does not recreate historical training-container commits (Table 2: NOT RECOVERED).</w:t>
+        <w:t>Next-response correctness is not latent mastery: y=0 is an incorrect next attempt, not a latent-skill diagnosis. The threshold gate is the simulated probe defined in Section III.H. There is no classroom RCT. We do not train graph, contrastive, or self-supervised KT models. BKT is not a scored baseline because pyBKT 1.4.1 produced a degenerate fit on the tested ASSISTments seed-42 configuration (reported in the accompanying artifact). IRT is the classical reference. T-KT is the local reference in Section III.C. Official SimpleKT remains the external ASSISTments check reported there. Temporal evaluation uses a single corrected cutoff (seed 42). Seeds 2025 and 2026 share a split. R/L/I are descriptive support flags. ECE depends on binning. We do not report size-matched or cluster-bootstrap confidence intervals for primary stratum ΔECE; because Table A1 also shows ΔECE shrinking as sparse N grows, we interpret the sign of the dense-to-sparse ECE contrast, not its magnitude [26], [27]. Three datasets cannot establish a universal diagnostic law. We evaluate Junyi at the ucid level only; other concept granularities in that dump are not assessed and are left to future work. The reported diagnostics are reproduced from the frozen accompanying artifact submitted with this manuscript. Locked ASSISTments T-KT ECE cells and the accompanying artifact stratum-AUC and baseline-inventory tables rebuild from frozen summaries (scripts/rebuild_locked_tables.sh); that command does not retrain models and does not recreate historical training-container commits (Table 2: NOT RECOVERED).</w:t>
       </w:r>
     </w:p>
     <w:p>
@@ -11869,7 +11864,7 @@
         <w:spacing w:line="252" w:lineRule="exact"/>
       </w:pPr>
       <w:r>
-        <w:t>Under the evaluated conditions, KT models can exhibit larger observed calibration error on sparse KCs in some dataset-model settings even when aggregate AUC appears adequate. That ECE association appears for T-KT on ASSISTments 2012 (Limited sparse support). It is not reported for Junyi’s empty learner-based sparse bucket. XES3G5M T-KT ECE does not show the same adverse dense-to-sparse gradient as ASSISTments (0.1176 / 0.1129 / 0.1254, descriptive); XES DKT calibration does not follow that T-KT pattern. The train-only strata, leakage checklist, and per-stratum ECE/Brier diagnostics are therefore conditionally useful. Methodological extensions beyond the present diagnostic protocol are outside the scope of this study. This paper is a protocol and calibration diagnostic, not a new KT model and not a classroom intervention.</w:t>
+        <w:t>Under the evaluated conditions, KT models can exhibit larger observed calibration error on sparse KCs in some dataset-model settings even when aggregate AUC appears adequate. That ECE association appears for T-KT on ASSISTments 2012 (Limited sparse support). It is not reported for Junyi’s empty learner-based sparse bucket. XES3G5M T-KT ECE does not show the same adverse dense-to-sparse gradient as ASSISTments (0.1176 / 0.1129 / 0.1254; Section IV.B); XES DKT calibration does not follow that T-KT pattern. The train-only strata, leakage checklist, and per-stratum ECE/Brier diagnostics are therefore conditionally useful. Methodological extensions beyond the present diagnostic protocol are outside the scope of this study. This paper is a protocol and calibration diagnostic, not a new KT model and not a classroom intervention.</w:t>
       </w:r>
     </w:p>
     <w:p>
@@ -11913,7 +11908,7 @@
         <w:spacing w:before="80" w:after="40"/>
       </w:pPr>
       <w:r>
-        <w:t>Table A1. Three train-only KC-frequency cut grids on ASSISTments 2012 (T-KT and DKT), rows ordered by increasing sparse N. Four-partition means (seeds 2025/2026 averaged first). Dense: f≥t2. Sparse: t0≤f&lt;t1. Main reprints Table 5 ECE (T-KT 0.1136/0.2280; DKT 0.0602/0.2333). Alt grids use the same 15-bin ECE on the frozen rerun CSVs. Official SimpleKT is not regrouped here. Not a new model.</w:t>
+        <w:t>Table A1. Three train-only KC-frequency cut grids on ASSISTments 2012 (T-KT and DKT), rows ordered by increasing sparse N. Four-partition means (seeds 2025/2026 averaged first). Dense: f≥t2. Sparse: t0≤f&lt;t1. Main reprints Table 5 ECE (T-KT 0.1136/0.2280; DKT 0.0602/0.2333). Alt grids use the same 15-bin ECE on the frozen rerun CSVs. Official SimpleKT is not regrouped here.</w:t>
       </w:r>
     </w:p>
     <w:tbl>
@@ -12719,7 +12714,7 @@
         <w:spacing w:before="80" w:after="40"/>
       </w:pPr>
       <w:r>
-        <w:t>Table A2. Simulated gate at τ=0.7, ASSISTments 2012 fold 0 (seed 42); T-KT and DKT only. Sparse occupancy is Limited. FAR 95% CIs: KC-cluster percentile, B=2000. Locked cells: T-KT FAR 0.196 / 0.268. Seed-42 ΔFAR 95% CI: T-KT [0.006, 0.138]; DKT [0.019, 0.175]. Not a classroom trial.</w:t>
+        <w:t>Table A2. Simulated gate at τ=0.7, ASSISTments 2012 fold 0 (seed 42); T-KT and DKT only. Sparse occupancy is Limited. FAR 95% CIs: KC-cluster percentile, B=2000. Locked cells: T-KT FAR 0.196 / 0.268. Seed-42 ΔFAR 95% CI: T-KT [0.006, 0.138]; DKT [0.019, 0.175].</w:t>
       </w:r>
     </w:p>
     <w:tbl>

</xml_diff>